<commit_message>
Agregar version del informe con formato APA y seccion de referencias
- informe-apa.docx: portada, interlineado doble, Times New Roman 12,
  numeracion de paginas, encabezados por nivel de APA, 10 tablas y 19
  figuras numeradas con titulo
- Seccion de referencias con las fuentes efectivamente consultadas
- Quitar de 'mejoras a futuro' la semilla configurable, que ya esta hecha
</commit_message>
<xml_diff>
--- a/docs/informe.docx
+++ b/docs/informe.docx
@@ -18927,25 +18927,6 @@
           <w:b/>
           <w:bCs/>
         </w:rPr>
-        <w:t xml:space="preserve">Semilla configurable por línea de comandos</w:t>
-      </w:r>
-      <w:r>
-        <w:t xml:space="preserve">, necesaria para el experimento de convergencia con repeticiones independientes.</w:t>
-      </w:r>
-    </w:p>
-    <w:p>
-      <w:pPr>
-        <w:pStyle w:val="ListParagraph"/>
-        <w:numPr>
-          <w:ilvl w:val="0"/>
-          <w:numId w:val="1"/>
-        </w:numPr>
-      </w:pPr>
-      <w:r>
-        <w:rPr>
-          <w:b/>
-          <w:bCs/>
-        </w:rPr>
         <w:t xml:space="preserve">Separar las semillas de los procesos</w:t>
       </w:r>
       <w:r>
@@ -18960,6 +18941,87 @@
       </w:r>
       <w:r>
         <w:t xml:space="preserve">) y verificar la independencia de las secuencias comparando la estimación que produce cada semilla por separado.</w:t>
+      </w:r>
+    </w:p>
+    <w:p>
+      <w:pPr>
+        <w:pStyle w:val="Heading1"/>
+        <w:spacing w:after="120" w:before="240"/>
+      </w:pPr>
+      <w:r>
+        <w:t xml:space="preserve">8. Referencias</w:t>
+      </w:r>
+    </w:p>
+    <w:p>
+      <w:pPr>
+        <w:spacing w:after="120"/>
+      </w:pPr>
+      <w:r>
+        <w:t xml:space="preserve">Cátedra de Métodos Numéricos II – Computación Científica. (2026). </w:t>
+      </w:r>
+      <w:r>
+        <w:rPr>
+          <w:i/>
+          <w:iCs/>
+        </w:rPr>
+        <w:t xml:space="preserve">Computación de alto rendimiento para aplicaciones numéricas</w:t>
+      </w:r>
+      <w:r>
+        <w:t xml:space="preserve"> [Material de clase]. Facultad de Ciencias Exactas y Tecnología, Universidad Nacional de Tucumán.</w:t>
+      </w:r>
+    </w:p>
+    <w:p>
+      <w:pPr>
+        <w:spacing w:after="120"/>
+      </w:pPr>
+      <w:r>
+        <w:t xml:space="preserve">Cátedra de Métodos Numéricos II – Computación Científica. (2026). </w:t>
+      </w:r>
+      <w:r>
+        <w:rPr>
+          <w:i/>
+          <w:iCs/>
+        </w:rPr>
+        <w:t xml:space="preserve">Trabajo práctico 1: HPC</w:t>
+      </w:r>
+      <w:r>
+        <w:t xml:space="preserve"> [Material de clase]. Facultad de Ciencias Exactas y Tecnología, Universidad Nacional de Tucumán.</w:t>
+      </w:r>
+    </w:p>
+    <w:p>
+      <w:pPr>
+        <w:spacing w:after="120"/>
+      </w:pPr>
+      <w:r>
+        <w:t xml:space="preserve">The Open MPI Project. (s.f.). </w:t>
+      </w:r>
+      <w:r>
+        <w:rPr>
+          <w:i/>
+          <w:iCs/>
+        </w:rPr>
+        <w:t xml:space="preserve">Open MPI documentation</w:t>
+      </w:r>
+      <w:r>
+        <w:t xml:space="preserve">. Recuperado el 12 de octubre de 2026, de https://www.open-mpi.org/doc/</w:t>
+      </w:r>
+    </w:p>
+    <w:p>
+      <w:pPr>
+        <w:spacing w:after="120"/>
+      </w:pPr>
+      <w:r>
+        <w:t xml:space="preserve">&gt; </w:t>
+      </w:r>
+      <w:r>
+        <w:rPr>
+          <w:b/>
+          <w:bCs/>
+        </w:rPr>
+        <w:t xml:space="preserve">Falta completar:</w:t>
+      </w:r>
+      <w:r>
+        <w:t xml:space="preserve"> estas son las únicas fuentes que efectivamente se &gt; consultaron para este trabajo. Antes de la entrega hay que agregar la &gt; bibliografía sobre la paradoja del cumpleaños y sobre el método de Monte &gt; Carlo, y citarla en el texto donde corresponda (secciones 2 y 3). APA exige &gt; que toda obra listada aquí aparezca citada en el cuerpo del informe, y &gt; viceversa.</w:t>
       </w:r>
     </w:p>
     <w:sectPr>

</xml_diff>